<commit_message>
Interim report v10: all four research questions written up
</commit_message>
<xml_diff>
--- a/report/QM640_Interim_Report_v4.docx
+++ b/report/QM640_Interim_Report_v4.docx
@@ -6406,7 +6406,7 @@
         </w:rPr>
         <w:drawing>
           <wp:inline distT="0" distB="0" distL="0" distR="0">
-            <wp:extent cx="5760720" cy="2658793"/>
+            <wp:extent cx="5760720" cy="2880360"/>
             <wp:effectExtent l="0" t="0" r="0" b="0"/>
             <wp:docPr id="901" name="Picture 901"/>
             <wp:cNvGraphicFramePr>
@@ -6428,7 +6428,7 @@
                   <pic:spPr>
                     <a:xfrm>
                       <a:off x="0" y="0"/>
-                      <a:ext cx="5760720" cy="2658793"/>
+                      <a:ext cx="5760720" cy="2880360"/>
                     </a:xfrm>
                     <a:prstGeom prst="rect">
                       <a:avLst/>
@@ -6487,7 +6487,7 @@
         </w:rPr>
         <w:drawing>
           <wp:inline distT="0" distB="0" distL="0" distR="0">
-            <wp:extent cx="5760720" cy="2304288"/>
+            <wp:extent cx="5760720" cy="2728762"/>
             <wp:effectExtent l="0" t="0" r="0" b="0"/>
             <wp:docPr id="902" name="Picture 902"/>
             <wp:cNvGraphicFramePr>
@@ -6509,7 +6509,7 @@
                   <pic:spPr>
                     <a:xfrm>
                       <a:off x="0" y="0"/>
-                      <a:ext cx="5760720" cy="2304288"/>
+                      <a:ext cx="5760720" cy="2728762"/>
                     </a:xfrm>
                     <a:prstGeom prst="rect">
                       <a:avLst/>
@@ -6542,7 +6542,7 @@
         <w:ind w:firstLine="720"/>
       </w:pPr>
       <w:r>
-        <w:t xml:space="preserve">Figure 4 contains the most consequential finding of the exploratory analysis. Pooled across tickers, moving from the lowest to the highest attention quintile is associated with 21.6% lower next-day volatility, which contradicts the established result that attention and volatility move together (Audrino et al., 2020). Comparing each ticker against its own mean reverses the sign: within tickers, the highest attention quintile carries 9.9% higher next-day volatility than the lowest, and the relationship is monotonic across all five quintiles. Sentiment behaves differently, showing no consistent pattern in either specification, at -2.7% pooled and -2.2% within ticker. The pooled estimate is an artefact, for the reason set out in Figure 5, and the practical consequence is that the models addressing RQ2 must include ticker fixed effects. Attention, rather than sentiment tone, emerges as the stronger candidate predictor.</w:t>
+        <w:t xml:space="preserve">Figure 4 contains the most consequential finding of the exploratory analysis. Pooled across tickers, moving from the lowest to the highest attention band is associated with 28.7% lower next-day volatility, which contradicts the established result that attention and volatility move together (Audrino et al., 2020). Comparing each ticker against its own mean reverses the sign: within tickers, days with seven or more articles carry 9.3% higher next-day volatility than days with none, and the relationship rises monotonically across all five bands. Sentiment behaves differently, showing no consistent pattern in either specification, at -2.7% pooled and -1.9% within ticker. The pooled estimate is an artefact, for the reason set out in Figure 5, and the practical consequence is that the models addressing RQ2 must include ticker fixed effects. Attention, rather than sentiment tone, emerges as the stronger candidate predictor.</w:t>
       </w:r>
     </w:p>
     <w:p>
@@ -6558,7 +6558,7 @@
         <w:rPr>
           <w:i/>
         </w:rPr>
-        <w:t>Next-Day Volatility by Predictor Quintile, Pooled and Within Ticker</w:t>
+        <w:t>Next-Day Volatility by Predictor Group, Pooled and Within Ticker</w:t>
       </w:r>
     </w:p>
     <w:p>
@@ -6568,7 +6568,7 @@
         </w:rPr>
         <w:drawing>
           <wp:inline distT="0" distB="0" distL="0" distR="0">
-            <wp:extent cx="5760720" cy="4762195"/>
+            <wp:extent cx="5760720" cy="4777182"/>
             <wp:effectExtent l="0" t="0" r="0" b="0"/>
             <wp:docPr id="903" name="Picture 903"/>
             <wp:cNvGraphicFramePr>
@@ -6590,7 +6590,7 @@
                   <pic:spPr>
                     <a:xfrm>
                       <a:off x="0" y="0"/>
-                      <a:ext cx="5760720" cy="4762195"/>
+                      <a:ext cx="5760720" cy="4777182"/>
                     </a:xfrm>
                     <a:prstGeom prst="rect">
                       <a:avLst/>
@@ -6615,7 +6615,7 @@
         <w:rPr>
           <w:sz w:val="22"/>
         </w:rPr>
-        <w:t xml:space="preserve">Upper panels pool all tickers. Lower panels express the target relative to each ticker's own mean, so that 1.00 denotes a typical day for that stock. Error bars are 95% confidence intervals.</w:t>
+        <w:t xml:space="preserve">Upper panels pool all tickers; lower panels express the target relative to each ticker's own mean, so that 1.00 denotes a typical day for that stock. Sentiment is grouped into quintiles. Attention is grouped by article count rather than quintiles, because a quarter of ticker-days have exactly zero articles and quantile boundaries would either collapse or split identical observations. Error bars are 95% confidence intervals.</w:t>
       </w:r>
     </w:p>
     <w:p>
@@ -7788,7 +7788,7 @@
               <w:rPr>
                 <w:sz w:val="20"/>
               </w:rPr>
-              <w:t xml:space="preserve">Quintile means, pooled versus within ticker</w:t>
+              <w:t xml:space="preserve">Group means, pooled versus within ticker</w:t>
             </w:r>
           </w:p>
         </w:tc>
@@ -7804,7 +7804,7 @@
               <w:rPr>
                 <w:sz w:val="20"/>
               </w:rPr>
-              <w:t xml:space="preserve">Attention effect reverses sign: -21.6% pooled, +9.9% within</w:t>
+              <w:t xml:space="preserve">Attention effect reverses sign: -28.7% pooled, +9.3% within</w:t>
             </w:r>
           </w:p>
         </w:tc>
@@ -8759,6 +8759,401 @@
       </w:pPr>
       <w:r>
         <w:t xml:space="preserve">Because all four analyses draw on the same collected data, the study adopts the largest of the four minima. Three of the four requirements are met comfortably: the labelled StockTwits corpus contains 4,222 messages against the 385 required for RQ1, and the analysis panel contains 3,840 ticker-days against the 549 and 614 required for RQ2 and RQ3. RQ4 is the binding and unmet constraint, and is reported honestly rather than absorbed into the pooled figure. Its requirement of 1,558 observations is expressed in trading days, and the study window contains only 500. Pooling the eight tickers to 3,840 ticker-days does not resolve this, because daily returns on large-capitalisation technology stocks are strongly cross-correlated, so the effective number of independent observations is far below the row count. RQ4 is therefore under-powered by design, its test is implemented with a block bootstrap to respect that dependence, and a null result must be interpreted as inconclusive rather than as evidence of no effect.</w:t>
+      </w:r>
+    </w:p>
+    <w:p>
+      <w:pPr>
+        <w:ind w:firstLine="720"/>
+      </w:pPr>
+      <w:r>
+        <w:t xml:space="preserve">Meeting a minimum sample size is necessary but not sufficient, because the ticker-days are not independent of one another. Table 8 therefore restates the available sample on three bases and reports the smallest effect RQ2 could detect on each. Even on the most conservative basis the design retains power to detect a small effect in Cohen's (1988) terms, which is the magnitude the literature leads the study to expect.</w:t>
+      </w:r>
+    </w:p>
+    <w:p>
+      <w:r>
+        <w:rPr>
+          <w:b/>
+        </w:rPr>
+        <w:t>Table 8</w:t>
+      </w:r>
+    </w:p>
+    <w:p>
+      <w:r>
+        <w:rPr>
+          <w:i/>
+        </w:rPr>
+        <w:t>Effective Sample Size and Minimum Detectable Effect for RQ2</w:t>
+      </w:r>
+    </w:p>
+    <w:tbl>
+      <w:tblPr>
+        <w:tblW w:w="9360" w:type="dxa"/>
+        <w:tblBorders>
+          <w:top w:val="single" w:sz="4" w:space="0" w:color="888888"/>
+          <w:bottom w:val="single" w:sz="4" w:space="0" w:color="888888"/>
+          <w:insideH w:val="single" w:sz="4" w:space="0" w:color="888888"/>
+        </w:tblBorders>
+        <w:tblLook w:val="04A0" w:firstRow="1" w:lastRow="0" w:firstColumn="1" w:lastColumn="0" w:noHBand="0" w:noVBand="1"/>
+      </w:tblPr>
+      <w:tblGrid>
+        <w:gridCol w:w="1900"/>
+        <w:gridCol w:w="900"/>
+        <w:gridCol w:w="3200"/>
+        <w:gridCol w:w="1200"/>
+        <w:gridCol w:w="2160"/>
+      </w:tblGrid>
+      <w:tr>
+        <w:tc>
+          <w:tcPr>
+            <w:tcW w:w="1900" w:type="dxa"/>
+            <w:shd w:val="clear" w:color="auto" w:fill="D9D9D9"/>
+          </w:tcPr>
+          <w:p>
+            <w:pPr>
+              <w:spacing w:line="240" w:lineRule="auto"/>
+            </w:pPr>
+            <w:r>
+              <w:rPr>
+                <w:b/>
+                <w:sz w:val="20"/>
+              </w:rPr>
+              <w:t xml:space="preserve">Basis</w:t>
+            </w:r>
+          </w:p>
+        </w:tc>
+        <w:tc>
+          <w:tcPr>
+            <w:tcW w:w="900" w:type="dxa"/>
+            <w:shd w:val="clear" w:color="auto" w:fill="D9D9D9"/>
+          </w:tcPr>
+          <w:p>
+            <w:pPr>
+              <w:spacing w:line="240" w:lineRule="auto"/>
+            </w:pPr>
+            <w:r>
+              <w:rPr>
+                <w:b/>
+                <w:sz w:val="20"/>
+              </w:rPr>
+              <w:t xml:space="preserve">N</w:t>
+            </w:r>
+          </w:p>
+        </w:tc>
+        <w:tc>
+          <w:tcPr>
+            <w:tcW w:w="3200" w:type="dxa"/>
+            <w:shd w:val="clear" w:color="auto" w:fill="D9D9D9"/>
+          </w:tcPr>
+          <w:p>
+            <w:pPr>
+              <w:spacing w:line="240" w:lineRule="auto"/>
+            </w:pPr>
+            <w:r>
+              <w:rPr>
+                <w:b/>
+                <w:sz w:val="20"/>
+              </w:rPr>
+              <w:t xml:space="preserve">Rationale</w:t>
+            </w:r>
+          </w:p>
+        </w:tc>
+        <w:tc>
+          <w:tcPr>
+            <w:tcW w:w="1200" w:type="dxa"/>
+            <w:shd w:val="clear" w:color="auto" w:fill="D9D9D9"/>
+          </w:tcPr>
+          <w:p>
+            <w:pPr>
+              <w:spacing w:line="240" w:lineRule="auto"/>
+            </w:pPr>
+            <w:r>
+              <w:rPr>
+                <w:b/>
+                <w:sz w:val="20"/>
+              </w:rPr>
+              <w:t xml:space="preserve">Detectable f²</w:t>
+            </w:r>
+          </w:p>
+        </w:tc>
+        <w:tc>
+          <w:tcPr>
+            <w:tcW w:w="2160" w:type="dxa"/>
+            <w:shd w:val="clear" w:color="auto" w:fill="D9D9D9"/>
+          </w:tcPr>
+          <w:p>
+            <w:pPr>
+              <w:spacing w:line="240" w:lineRule="auto"/>
+            </w:pPr>
+            <w:r>
+              <w:rPr>
+                <w:b/>
+                <w:sz w:val="20"/>
+              </w:rPr>
+              <w:t xml:space="preserve">Interpretation</w:t>
+            </w:r>
+          </w:p>
+        </w:tc>
+      </w:tr>
+      <w:tr>
+        <w:tc>
+          <w:tcPr>
+            <w:tcW w:w="1900" w:type="dxa"/>
+          </w:tcPr>
+          <w:p>
+            <w:pPr>
+              <w:spacing w:line="240" w:lineRule="auto"/>
+            </w:pPr>
+            <w:r>
+              <w:rPr>
+                <w:sz w:val="20"/>
+              </w:rPr>
+              <w:t xml:space="preserve">Pooled ticker-days</w:t>
+            </w:r>
+          </w:p>
+        </w:tc>
+        <w:tc>
+          <w:tcPr>
+            <w:tcW w:w="900" w:type="dxa"/>
+          </w:tcPr>
+          <w:p>
+            <w:pPr>
+              <w:spacing w:line="240" w:lineRule="auto"/>
+            </w:pPr>
+            <w:r>
+              <w:rPr>
+                <w:sz w:val="20"/>
+              </w:rPr>
+              <w:t xml:space="preserve">3,840</w:t>
+            </w:r>
+          </w:p>
+        </w:tc>
+        <w:tc>
+          <w:tcPr>
+            <w:tcW w:w="3200" w:type="dxa"/>
+          </w:tcPr>
+          <w:p>
+            <w:pPr>
+              <w:spacing w:line="240" w:lineRule="auto"/>
+            </w:pPr>
+            <w:r>
+              <w:rPr>
+                <w:sz w:val="20"/>
+              </w:rPr>
+              <w:t xml:space="preserve">Raw row count; assumes every observation is independent</w:t>
+            </w:r>
+          </w:p>
+        </w:tc>
+        <w:tc>
+          <w:tcPr>
+            <w:tcW w:w="1200" w:type="dxa"/>
+          </w:tcPr>
+          <w:p>
+            <w:pPr>
+              <w:spacing w:line="240" w:lineRule="auto"/>
+            </w:pPr>
+            <w:r>
+              <w:rPr>
+                <w:sz w:val="20"/>
+              </w:rPr>
+              <w:t xml:space="preserve">0.003</w:t>
+            </w:r>
+          </w:p>
+        </w:tc>
+        <w:tc>
+          <w:tcPr>
+            <w:tcW w:w="2160" w:type="dxa"/>
+          </w:tcPr>
+          <w:p>
+            <w:pPr>
+              <w:spacing w:line="240" w:lineRule="auto"/>
+            </w:pPr>
+            <w:r>
+              <w:rPr>
+                <w:sz w:val="20"/>
+              </w:rPr>
+              <w:t xml:space="preserve">Optimistic; overstates precision</w:t>
+            </w:r>
+          </w:p>
+        </w:tc>
+      </w:tr>
+      <w:tr>
+        <w:tc>
+          <w:tcPr>
+            <w:tcW w:w="1900" w:type="dxa"/>
+          </w:tcPr>
+          <w:p>
+            <w:pPr>
+              <w:spacing w:line="240" w:lineRule="auto"/>
+            </w:pPr>
+            <w:r>
+              <w:rPr>
+                <w:sz w:val="20"/>
+              </w:rPr>
+              <w:t xml:space="preserve">Correlation-adjusted</w:t>
+            </w:r>
+          </w:p>
+        </w:tc>
+        <w:tc>
+          <w:tcPr>
+            <w:tcW w:w="900" w:type="dxa"/>
+          </w:tcPr>
+          <w:p>
+            <w:pPr>
+              <w:spacing w:line="240" w:lineRule="auto"/>
+            </w:pPr>
+            <w:r>
+              <w:rPr>
+                <w:sz w:val="20"/>
+              </w:rPr>
+              <w:t xml:space="preserve">1,093</w:t>
+            </w:r>
+          </w:p>
+        </w:tc>
+        <w:tc>
+          <w:tcPr>
+            <w:tcW w:w="3200" w:type="dxa"/>
+          </w:tcPr>
+          <w:p>
+            <w:pPr>
+              <w:spacing w:line="240" w:lineRule="auto"/>
+            </w:pPr>
+            <w:r>
+              <w:rPr>
+                <w:sz w:val="20"/>
+              </w:rPr>
+              <w:t xml:space="preserve">8 / (1 + 7 x 0.359) = 2.28 effective series x 480 dates</w:t>
+            </w:r>
+          </w:p>
+        </w:tc>
+        <w:tc>
+          <w:tcPr>
+            <w:tcW w:w="1200" w:type="dxa"/>
+          </w:tcPr>
+          <w:p>
+            <w:pPr>
+              <w:spacing w:line="240" w:lineRule="auto"/>
+            </w:pPr>
+            <w:r>
+              <w:rPr>
+                <w:sz w:val="20"/>
+              </w:rPr>
+              <w:t xml:space="preserve">0.010</w:t>
+            </w:r>
+          </w:p>
+        </w:tc>
+        <w:tc>
+          <w:tcPr>
+            <w:tcW w:w="2160" w:type="dxa"/>
+          </w:tcPr>
+          <w:p>
+            <w:pPr>
+              <w:spacing w:line="240" w:lineRule="auto"/>
+            </w:pPr>
+            <w:r>
+              <w:rPr>
+                <w:sz w:val="20"/>
+              </w:rPr>
+              <w:t xml:space="preserve">Primary basis reported in this study</w:t>
+            </w:r>
+          </w:p>
+        </w:tc>
+      </w:tr>
+      <w:tr>
+        <w:tc>
+          <w:tcPr>
+            <w:tcW w:w="1900" w:type="dxa"/>
+          </w:tcPr>
+          <w:p>
+            <w:pPr>
+              <w:spacing w:line="240" w:lineRule="auto"/>
+            </w:pPr>
+            <w:r>
+              <w:rPr>
+                <w:sz w:val="20"/>
+              </w:rPr>
+              <w:t xml:space="preserve">Distinct trading dates</w:t>
+            </w:r>
+          </w:p>
+        </w:tc>
+        <w:tc>
+          <w:tcPr>
+            <w:tcW w:w="900" w:type="dxa"/>
+          </w:tcPr>
+          <w:p>
+            <w:pPr>
+              <w:spacing w:line="240" w:lineRule="auto"/>
+            </w:pPr>
+            <w:r>
+              <w:rPr>
+                <w:sz w:val="20"/>
+              </w:rPr>
+              <w:t xml:space="preserve">480</w:t>
+            </w:r>
+          </w:p>
+        </w:tc>
+        <w:tc>
+          <w:tcPr>
+            <w:tcW w:w="3200" w:type="dxa"/>
+          </w:tcPr>
+          <w:p>
+            <w:pPr>
+              <w:spacing w:line="240" w:lineRule="auto"/>
+            </w:pPr>
+            <w:r>
+              <w:rPr>
+                <w:sz w:val="20"/>
+              </w:rPr>
+              <w:t xml:space="preserve">Treats each date as one cluster, ignoring cross-sectional information</w:t>
+            </w:r>
+          </w:p>
+        </w:tc>
+        <w:tc>
+          <w:tcPr>
+            <w:tcW w:w="1200" w:type="dxa"/>
+          </w:tcPr>
+          <w:p>
+            <w:pPr>
+              <w:spacing w:line="240" w:lineRule="auto"/>
+            </w:pPr>
+            <w:r>
+              <w:rPr>
+                <w:sz w:val="20"/>
+              </w:rPr>
+              <w:t xml:space="preserve">0.023</w:t>
+            </w:r>
+          </w:p>
+        </w:tc>
+        <w:tc>
+          <w:tcPr>
+            <w:tcW w:w="2160" w:type="dxa"/>
+          </w:tcPr>
+          <w:p>
+            <w:pPr>
+              <w:spacing w:line="240" w:lineRule="auto"/>
+            </w:pPr>
+            <w:r>
+              <w:rPr>
+                <w:sz w:val="20"/>
+              </w:rPr>
+              <w:t xml:space="preserve">Most conservative; still near the small-effect threshold</w:t>
+            </w:r>
+          </w:p>
+        </w:tc>
+      </w:tr>
+    </w:tbl>
+    <w:p>
+      <w:r>
+        <w:rPr>
+          <w:i/>
+          <w:sz w:val="22"/>
+        </w:rPr>
+        <w:t xml:space="preserve">Note. </w:t>
+      </w:r>
+      <w:r>
+        <w:rPr>
+          <w:sz w:val="22"/>
+        </w:rPr>
+        <w:t xml:space="preserve">Computed at alpha = .05 and power = .80 with u = 3 tested predictors and L = 10.90 (Cohen, 1988). Cohen's benchmarks are f² = 0.02 (small), 0.15 (medium) and 0.35 (large). Generated by src/run_eda.py.</w:t>
       </w:r>
     </w:p>
     <w:p>
@@ -9009,7 +9404,7 @@
         <w:ind w:firstLine="720"/>
       </w:pPr>
       <w:r>
-        <w:t>The feature set combines news-derived sentiment features with lagged market controls; the target is the next-day realized volatility. Table 8 summarises the feature set and its usage.</w:t>
+        <w:t>The feature set combines news-derived sentiment features with lagged market controls; the target is the next-day realized volatility. Table 9 summarises the feature set and its usage.</w:t>
       </w:r>
     </w:p>
     <w:p>
@@ -9017,7 +9412,7 @@
         <w:rPr>
           <w:b/>
         </w:rPr>
-        <w:t>Table 8</w:t>
+        <w:t>Table 9</w:t>
       </w:r>
     </w:p>
     <w:p>
@@ -9530,7 +9925,7 @@
         <w:ind w:firstLine="720"/>
       </w:pPr>
       <w:r>
-        <w:t>Metrics are matched to each question's form. Table 9 lists the metrics, their formulae, and the research question to which each applies; worked illustrative calculations are retained from the synopsis and will be recomputed on real results in the final report.</w:t>
+        <w:t>Metrics are matched to each question's form. Table 10 lists the metrics, their formulae, and the research question to which each applies; worked illustrative calculations are retained from the synopsis and will be recomputed on real results in the final report.</w:t>
       </w:r>
     </w:p>
     <w:p>
@@ -9538,7 +9933,7 @@
         <w:rPr>
           <w:b/>
         </w:rPr>
-        <w:t>Table 9</w:t>
+        <w:t>Table 10</w:t>
       </w:r>
     </w:p>
     <w:p>
@@ -10060,7 +10455,7 @@
         <w:rPr>
           <w:b/>
         </w:rPr>
-        <w:t>Table 10</w:t>
+        <w:t>Table 11</w:t>
       </w:r>
     </w:p>
     <w:p>
@@ -10554,6 +10949,21 @@
     <w:p>
       <w:r>
         <w:t xml:space="preserve">Statistical power for RQ4 is limited: the strategy test requires 1,558 trading days and the study window provides 500, so the backtest is under-powered and a null result there is inconclusive rather than negative; mitigated by a block-bootstrap implementation of the Ledoit-Wolf test and by explicit reporting of the shortfall.</w:t>
+      </w:r>
+    </w:p>
+    <w:p>
+      <w:r>
+        <w:t xml:space="preserve">Effective sample size is materially smaller than the row count. The eight tickers move together, with a mean pairwise correlation of 0.359 in realized volatility, so the 3,840 ticker-days correspond to roughly 2.3 independent series and an effective sample nearer 1,093 observations; mitigated by reporting standard errors clustered by date and by sizing claims against the adjusted figure rather than the raw row count.</w:t>
+      </w:r>
+    </w:p>
+    <w:p>
+      <w:r>
+        <w:t xml:space="preserve">The study window contains a single volatility regime. Quarterly cross-sectional mean volatility varies only 1.25-fold across 2023-2024, with no crisis or sustained stress episode, so the models are trained and validated under calm to moderate conditions only; mitigated by restricting all claims to comparable conditions and identifying regime generalisation as future work.</w:t>
+      </w:r>
+    </w:p>
+    <w:p>
+      <w:r>
+        <w:t xml:space="preserve">Attention is measured from news-media coverage rather than retail activity. The direct retail measure would be StockTwits message volume, which is unavailable historically because the API serves only recent messages; mitigated by treating article count as a proxy and stating the substitution explicitly.</w:t>
       </w:r>
     </w:p>
     <w:p>

</xml_diff>